<commit_message>
Ajouter le DOI Zenodo confirmé de v2.0.0 aux documents et citations
Actualisation documentaire après archivage : DOI 10.5281/zenodo.23389655, publié le 15 octobre 2026. Le tag v2.0.0 et ses calculs restent inchangés. Correction du DOI spécifique de v1.0.0 et du DOI regroupant toutes les versions.
</commit_message>
<xml_diff>
--- a/revision_joiv_20261012/03_reproductibilite/completion/final/Mode_emploi_renvoi_JOIV_FR.docx
+++ b/revision_joiv_20261012/03_reproductibilite/completion/final/Mode_emploi_renvoi_JOIV_FR.docx
@@ -12,7 +12,7 @@
     </w:p>
     <w:p>
       <w:r>
-        <w:t>PAMBOLO MAYAMBO Néhémie — 12 octobre 2026</w:t>
+        <w:t>PAMBOLO MAYAMBO Néhémie — citation actualisée le 15 octobre 2026</w:t>
       </w:r>
     </w:p>
     <w:p>
@@ -77,12 +77,12 @@
         <w:pStyle w:val="Heading1"/>
       </w:pPr>
       <w:r>
-        <w:t>Actualiser GitHub et Zenodo</w:t>
+        <w:t>Archive GitHub et Zenodo confirmée</w:t>
       </w:r>
     </w:p>
     <w:p>
       <w:r>
-        <w:t>Publier les nouveaux scripts et tableaux sur le dépôt du projet puis créer une nouvelle version publique. Le DOI de l’ancienne version v1.0.0 ne couvre pas les révisions récentes. Après création de la nouvelle archive Zenodo, remplacer la mention de version dans le manuscrit et la réponse par le DOI effectivement attribué. Aucun DOI nouveau n’est inventé dans ce dossier. Vérifier les droits de diffusion des données brutes; les grandes couches et sources restreintes ne sont pas toutes incluses.</w:t>
+        <w:t>La version GitHub v2.0.0 et son archive Zenodo sont publiées depuis le 15 octobre 2026. DOI à citer pour cette révision : https://doi.org/10.5281/zenodo.23389655. Le dépôt est https://github.com/Nehemy29/rdc-urban-hubs-spatial-optimization. Le DOI 10.5281/zenodo.22287395 désigne v1.0.0; 10.5281/zenodo.22287394 désigne toutes les versions. Le manuscrit et la réponse fournis ici incluent le DOI confirmé; ils sont à utiliser pour le renvoi. Le code et les calculs archivés sous v2.0.0, commit 8a4a186, restent figés. La mise à jour de citation du 15 octobre est distincte et ne nécessite pas de refaire les calculs ou de déplacer l’étiquette v2.0.0. La note Zenodo indiquant que le DOI sera ajouté provient du texte antérieur archivé; les métadonnées à jour sont dans le dépôt courant. Les données brutes lourdes et les sources sous restrictions ne sont pas toutes redistribuées.</w:t>
       </w:r>
     </w:p>
     <w:p>

</xml_diff>